<commit_message>
Update v4.0.0 documentation (.docx) with KR Unified Language and 18-target verification
</commit_message>
<xml_diff>
--- a/docs/KR_Compiler_Android_Benutzerhandbuch_v4.0_15-10-2026.docx
+++ b/docs/KR_Compiler_Android_Benutzerhandbuch_v4.0_15-10-2026.docx
@@ -1650,6 +1650,375 @@
         <w:pStyle w:val="Heading1"/>
       </w:pPr>
       <w:r>
+        <w:t>KR Unified Language (.kr) Vorlagen</w:t>
+      </w:r>
+    </w:p>
+    <w:p>
+      <w:r>
+        <w:t>Mit Version 4.0 können neue Projekte in der KR Unified Language (.kr) erstellt werden. Innerhalb einer einzigen .kr-Datei werden C++20, Rust und Go frei kombiniert. Die IDE bietet vier Vorlagen:</w:t>
+      </w:r>
+    </w:p>
+    <w:tbl>
+      <w:tblPr>
+        <w:tblStyle w:val="TableGrid"/>
+        <w:tblW w:type="auto" w:w="0"/>
+        <w:tblLayout w:type="fixed"/>
+        <w:tblLook w:firstColumn="1" w:firstRow="1" w:lastColumn="0" w:lastRow="0" w:noHBand="0" w:noVBand="1" w:val="04A0"/>
+        <w:tblBorders>
+          <w:top w:val="single" w:sz="6" w:color="D9D9D9"/>
+          <w:left w:val="single" w:sz="6" w:color="D9D9D9"/>
+          <w:bottom w:val="single" w:sz="6" w:color="D9D9D9"/>
+          <w:right w:val="single" w:sz="6" w:color="D9D9D9"/>
+          <w:insideH w:val="single" w:sz="6" w:color="D9D9D9"/>
+          <w:insideV w:val="single" w:sz="6" w:color="D9D9D9"/>
+        </w:tblBorders>
+      </w:tblPr>
+      <w:tblGrid>
+        <w:gridCol w:w="3389"/>
+        <w:gridCol w:w="3389"/>
+        <w:gridCol w:w="3389"/>
+      </w:tblGrid>
+      <w:tr>
+        <w:trPr>
+          <w:tblHeader w:val="true"/>
+        </w:trPr>
+        <w:tc>
+          <w:tcPr>
+            <w:tcW w:type="dxa" w:w="2880"/>
+            <w:shd w:fill="263238"/>
+            <w:tcMar>
+              <w:top w:w="110" w:type="dxa"/>
+              <w:start w:w="120" w:type="dxa"/>
+              <w:bottom w:w="110" w:type="dxa"/>
+              <w:end w:w="120" w:type="dxa"/>
+            </w:tcMar>
+            <w:vAlign w:val="center"/>
+          </w:tcPr>
+          <w:p>
+            <w:pPr>
+              <w:jc w:val="center"/>
+            </w:pPr>
+            <w:r>
+              <w:rPr>
+                <w:b/>
+                <w:color w:val="FFFFFF"/>
+              </w:rPr>
+              <w:t>KR Vorlage</w:t>
+            </w:r>
+          </w:p>
+        </w:tc>
+        <w:tc>
+          <w:tcPr>
+            <w:tcW w:type="dxa" w:w="3600"/>
+            <w:shd w:fill="263238"/>
+            <w:tcMar>
+              <w:top w:w="110" w:type="dxa"/>
+              <w:start w:w="120" w:type="dxa"/>
+              <w:bottom w:w="110" w:type="dxa"/>
+              <w:end w:w="120" w:type="dxa"/>
+            </w:tcMar>
+            <w:vAlign w:val="center"/>
+          </w:tcPr>
+          <w:p>
+            <w:pPr>
+              <w:jc w:val="center"/>
+            </w:pPr>
+            <w:r>
+              <w:rPr>
+                <w:b/>
+                <w:color w:val="FFFFFF"/>
+              </w:rPr>
+              <w:t>Sprachkombination</w:t>
+            </w:r>
+          </w:p>
+        </w:tc>
+        <w:tc>
+          <w:tcPr>
+            <w:tcW w:type="dxa" w:w="2664"/>
+            <w:shd w:fill="263238"/>
+            <w:tcMar>
+              <w:top w:w="110" w:type="dxa"/>
+              <w:start w:w="120" w:type="dxa"/>
+              <w:bottom w:w="110" w:type="dxa"/>
+              <w:end w:w="120" w:type="dxa"/>
+            </w:tcMar>
+            <w:vAlign w:val="center"/>
+          </w:tcPr>
+          <w:p>
+            <w:pPr>
+              <w:jc w:val="center"/>
+            </w:pPr>
+            <w:r>
+              <w:rPr>
+                <w:b/>
+                <w:color w:val="FFFFFF"/>
+              </w:rPr>
+              <w:t>Typ</w:t>
+            </w:r>
+          </w:p>
+        </w:tc>
+      </w:tr>
+      <w:tr>
+        <w:tc>
+          <w:tcPr>
+            <w:tcW w:type="dxa" w:w="2880"/>
+            <w:tcMar>
+              <w:top w:w="110" w:type="dxa"/>
+              <w:start w:w="120" w:type="dxa"/>
+              <w:bottom w:w="110" w:type="dxa"/>
+              <w:end w:w="120" w:type="dxa"/>
+            </w:tcMar>
+            <w:vAlign w:val="center"/>
+          </w:tcPr>
+          <w:p>
+            <w:pPr>
+              <w:jc w:val="left"/>
+            </w:pPr>
+            <w:r>
+              <w:t>KR Konsole</w:t>
+            </w:r>
+          </w:p>
+        </w:tc>
+        <w:tc>
+          <w:tcPr>
+            <w:tcW w:type="dxa" w:w="3600"/>
+            <w:tcMar>
+              <w:top w:w="110" w:type="dxa"/>
+              <w:start w:w="120" w:type="dxa"/>
+              <w:bottom w:w="110" w:type="dxa"/>
+              <w:end w:w="120" w:type="dxa"/>
+            </w:tcMar>
+            <w:vAlign w:val="center"/>
+          </w:tcPr>
+          <w:p>
+            <w:pPr>
+              <w:jc w:val="center"/>
+            </w:pPr>
+            <w:r>
+              <w:t>C++ / Rust / Go</w:t>
+            </w:r>
+          </w:p>
+        </w:tc>
+        <w:tc>
+          <w:tcPr>
+            <w:tcW w:type="dxa" w:w="2664"/>
+            <w:tcMar>
+              <w:top w:w="110" w:type="dxa"/>
+              <w:start w:w="120" w:type="dxa"/>
+              <w:bottom w:w="110" w:type="dxa"/>
+              <w:end w:w="120" w:type="dxa"/>
+            </w:tcMar>
+            <w:vAlign w:val="center"/>
+          </w:tcPr>
+          <w:p>
+            <w:pPr>
+              <w:jc w:val="center"/>
+            </w:pPr>
+            <w:r>
+              <w:t>Konsolenprogramm</w:t>
+            </w:r>
+          </w:p>
+        </w:tc>
+      </w:tr>
+      <w:tr>
+        <w:tc>
+          <w:tcPr>
+            <w:tcW w:type="dxa" w:w="2880"/>
+            <w:tcMar>
+              <w:top w:w="110" w:type="dxa"/>
+              <w:start w:w="120" w:type="dxa"/>
+              <w:bottom w:w="110" w:type="dxa"/>
+              <w:end w:w="120" w:type="dxa"/>
+            </w:tcMar>
+            <w:vAlign w:val="center"/>
+            <w:shd w:fill="E8F3F1"/>
+          </w:tcPr>
+          <w:p>
+            <w:pPr>
+              <w:jc w:val="left"/>
+            </w:pPr>
+            <w:r>
+              <w:t>KR GUI mit SDL3</w:t>
+            </w:r>
+          </w:p>
+        </w:tc>
+        <w:tc>
+          <w:tcPr>
+            <w:tcW w:type="dxa" w:w="3600"/>
+            <w:tcMar>
+              <w:top w:w="110" w:type="dxa"/>
+              <w:start w:w="120" w:type="dxa"/>
+              <w:bottom w:w="110" w:type="dxa"/>
+              <w:end w:w="120" w:type="dxa"/>
+            </w:tcMar>
+            <w:vAlign w:val="center"/>
+            <w:shd w:fill="E8F3F1"/>
+          </w:tcPr>
+          <w:p>
+            <w:pPr>
+              <w:jc w:val="center"/>
+            </w:pPr>
+            <w:r>
+              <w:t>C++ / SDL3</w:t>
+            </w:r>
+          </w:p>
+        </w:tc>
+        <w:tc>
+          <w:tcPr>
+            <w:tcW w:type="dxa" w:w="2664"/>
+            <w:tcMar>
+              <w:top w:w="110" w:type="dxa"/>
+              <w:start w:w="120" w:type="dxa"/>
+              <w:bottom w:w="110" w:type="dxa"/>
+              <w:end w:w="120" w:type="dxa"/>
+            </w:tcMar>
+            <w:vAlign w:val="center"/>
+            <w:shd w:fill="E8F3F1"/>
+          </w:tcPr>
+          <w:p>
+            <w:pPr>
+              <w:jc w:val="center"/>
+            </w:pPr>
+            <w:r>
+              <w:t>Grafisches Fenster</w:t>
+            </w:r>
+          </w:p>
+        </w:tc>
+      </w:tr>
+      <w:tr>
+        <w:tc>
+          <w:tcPr>
+            <w:tcW w:type="dxa" w:w="2880"/>
+            <w:tcMar>
+              <w:top w:w="110" w:type="dxa"/>
+              <w:start w:w="120" w:type="dxa"/>
+              <w:bottom w:w="110" w:type="dxa"/>
+              <w:end w:w="120" w:type="dxa"/>
+            </w:tcMar>
+            <w:vAlign w:val="center"/>
+          </w:tcPr>
+          <w:p>
+            <w:pPr>
+              <w:jc w:val="left"/>
+            </w:pPr>
+            <w:r>
+              <w:t>KR Sprachfusion Konsole</w:t>
+            </w:r>
+          </w:p>
+        </w:tc>
+        <w:tc>
+          <w:tcPr>
+            <w:tcW w:type="dxa" w:w="3600"/>
+            <w:tcMar>
+              <w:top w:w="110" w:type="dxa"/>
+              <w:start w:w="120" w:type="dxa"/>
+              <w:bottom w:w="110" w:type="dxa"/>
+              <w:end w:w="120" w:type="dxa"/>
+            </w:tcMar>
+            <w:vAlign w:val="center"/>
+          </w:tcPr>
+          <w:p>
+            <w:pPr>
+              <w:jc w:val="center"/>
+            </w:pPr>
+            <w:r>
+              <w:t>C++20 + Rust + Go</w:t>
+            </w:r>
+          </w:p>
+        </w:tc>
+        <w:tc>
+          <w:tcPr>
+            <w:tcW w:type="dxa" w:w="2664"/>
+            <w:tcMar>
+              <w:top w:w="110" w:type="dxa"/>
+              <w:start w:w="120" w:type="dxa"/>
+              <w:bottom w:w="110" w:type="dxa"/>
+              <w:end w:w="120" w:type="dxa"/>
+            </w:tcMar>
+            <w:vAlign w:val="center"/>
+          </w:tcPr>
+          <w:p>
+            <w:pPr>
+              <w:jc w:val="center"/>
+            </w:pPr>
+            <w:r>
+              <w:t>3-Sprachen Kreuzaufrufe</w:t>
+            </w:r>
+          </w:p>
+        </w:tc>
+      </w:tr>
+      <w:tr>
+        <w:tc>
+          <w:tcPr>
+            <w:tcW w:type="dxa" w:w="2880"/>
+            <w:tcMar>
+              <w:top w:w="110" w:type="dxa"/>
+              <w:start w:w="120" w:type="dxa"/>
+              <w:bottom w:w="110" w:type="dxa"/>
+              <w:end w:w="120" w:type="dxa"/>
+            </w:tcMar>
+            <w:vAlign w:val="center"/>
+            <w:shd w:fill="E8F3F1"/>
+          </w:tcPr>
+          <w:p>
+            <w:pPr>
+              <w:jc w:val="left"/>
+            </w:pPr>
+            <w:r>
+              <w:t>KR Sprachfusion GUI</w:t>
+            </w:r>
+          </w:p>
+        </w:tc>
+        <w:tc>
+          <w:tcPr>
+            <w:tcW w:type="dxa" w:w="3600"/>
+            <w:tcMar>
+              <w:top w:w="110" w:type="dxa"/>
+              <w:start w:w="120" w:type="dxa"/>
+              <w:bottom w:w="110" w:type="dxa"/>
+              <w:end w:w="120" w:type="dxa"/>
+            </w:tcMar>
+            <w:vAlign w:val="center"/>
+            <w:shd w:fill="E8F3F1"/>
+          </w:tcPr>
+          <w:p>
+            <w:pPr>
+              <w:jc w:val="center"/>
+            </w:pPr>
+            <w:r>
+              <w:t>C++20 + Rust + Go + SDL3</w:t>
+            </w:r>
+          </w:p>
+        </w:tc>
+        <w:tc>
+          <w:tcPr>
+            <w:tcW w:type="dxa" w:w="2664"/>
+            <w:tcMar>
+              <w:top w:w="110" w:type="dxa"/>
+              <w:start w:w="120" w:type="dxa"/>
+              <w:bottom w:w="110" w:type="dxa"/>
+              <w:end w:w="120" w:type="dxa"/>
+            </w:tcMar>
+            <w:vAlign w:val="center"/>
+            <w:shd w:fill="E8F3F1"/>
+          </w:tcPr>
+          <w:p>
+            <w:pPr>
+              <w:jc w:val="center"/>
+            </w:pPr>
+            <w:r>
+              <w:t>3-Sprachen GUI</w:t>
+            </w:r>
+          </w:p>
+        </w:tc>
+      </w:tr>
+    </w:tbl>
+    <w:p/>
+    <w:p>
+      <w:pPr>
+        <w:pStyle w:val="Heading1"/>
+      </w:pPr>
+      <w:r>
         <w:t>Querformat und TV Spiegelung</w:t>
       </w:r>
     </w:p>

</xml_diff>